<commit_message>
Update Review 1 submission: design evolution, ping spacing, date placeholder; add PDF
Co-Authored-By: Claude Opus 5.5 <noreply@anthropic.com>
Claude-Session: https://claude.ai/code/session_01RBCZvHRngDWn2z2Egxvtcp
</commit_message>
<xml_diff>
--- a/docs/VisionGuard_Review1.docx
+++ b/docs/VisionGuard_Review1.docx
@@ -243,7 +243,10 @@
           </w:tcPr>
           <w:p>
             <w:r>
-              <w:t>24 October 2026</w:t>
+              <w:rPr>
+                <w:highlight w:val="yellow"/>
+              </w:rPr>
+              <w:t xml:space="preserve">[DD Month YYYY]</w:t>
             </w:r>
           </w:p>
         </w:tc>
@@ -2286,7 +2289,7 @@
         <w:pStyle w:val="ListBullet"/>
       </w:pPr>
       <w:r>
-        <w:t xml:space="preserve">Completed: problem study and component selection; assembly of the cane on a PVC pipe (sensors, Arduino Nano, buzzer, battery and switch soldered and mounted); firmware for ultrasonic ranging, moisture sensing and prioritised alerts written and uploaded.</w:t>
+        <w:t xml:space="preserve">Completed: problem study; concept refined from an initial smart-shoe design to a cane (the tip reaches water before the foot, and a shaft-mounted sensor is steadier); component selection; assembly of the cane on a PVC pipe (sensors, Arduino Nano, buzzer, battery and switch soldered and mounted); firmware for ultrasonic ranging, moisture sensing and prioritised alerts written and uploaded.</w:t>
       </w:r>
     </w:p>
     <w:p>
@@ -2310,7 +2313,7 @@
         <w:pStyle w:val="ListBullet"/>
       </w:pPr>
       <w:r>
-        <w:t xml:space="preserve">Next steps before Review 2: calibrate the moisture threshold and extend the obstacle range to about 100 cm; add a vibration motor driven by the IRLZ44N MOSFET; add a 5 V boost converter, charging module and the 1 A fuse; average several readings to reduce false alerts; tidy the wiring into an enclosure and field-test the cane.</w:t>
+        <w:t xml:space="preserve">Next steps before Review 2: calibrate the moisture threshold and extend the obstacle range to about 100 cm; add a vibration motor driven by the IRLZ44N MOSFET; add a 5 V boost converter, charging module and the 1 A fuse; average several readings and space pings at least 60 ms apart (per the HC-SR04 datasheet) to reduce false alerts; tidy the wiring into an enclosure and field-test the cane.</w:t>
       </w:r>
     </w:p>
     <w:p/>

</xml_diff>